<commit_message>
Ajuste de saldo na importacao, exclusao de conta e trilha de aprendizado
</commit_message>
<xml_diff>
--- a/investai/docs/TERMO_DE_CONSENTIMENTO.docx
+++ b/investai/docs/TERMO_DE_CONSENTIMENTO.docx
@@ -32,6 +32,7 @@
     </w:p>
     <w:p>
       <w:pPr>
+        <w:keepNext w:val="false"/>
         <w:spacing w:after="160" w:line="300"/>
         <w:jc w:val="both"/>
       </w:pPr>
@@ -51,6 +52,7 @@
     </w:p>
     <w:p>
       <w:pPr>
+        <w:keepNext w:val="false"/>
         <w:spacing w:after="160" w:line="300"/>
         <w:jc w:val="both"/>
       </w:pPr>
@@ -60,6 +62,7 @@
     </w:p>
     <w:p>
       <w:pPr>
+        <w:keepNext w:val="false"/>
         <w:spacing w:after="160" w:line="300"/>
         <w:jc w:val="both"/>
       </w:pPr>
@@ -87,6 +90,7 @@
     </w:p>
     <w:p>
       <w:pPr>
+        <w:keepNext/>
         <w:spacing w:after="160" w:line="300"/>
         <w:jc w:val="both"/>
       </w:pPr>
@@ -301,13 +305,13 @@
               <w:t xml:space="preserve">Armazenada exclusivamente como hash</w:t>
             </w:r>
             <w:r>
-              <w:t xml:space="preserve"> (função </w:t>
+              <w:t xml:space="preserve"> (algoritmo </w:t>
             </w:r>
             <w:r>
               <w:rPr>
                 <w:rFonts w:ascii="Consolas" w:cs="Consolas" w:eastAsia="Consolas" w:hAnsi="Consolas"/>
               </w:rPr>
-              <w:t xml:space="preserve">pbkdf2:sha256</w:t>
+              <w:t xml:space="preserve">scrypt</w:t>
             </w:r>
             <w:r>
               <w:t xml:space="preserve">, biblioteca Werkzeug); a senha em texto não é gravada e não pode ser recuperada pelo projeto</w:t>
@@ -851,6 +855,7 @@
     </w:p>
     <w:p>
       <w:pPr>
+        <w:keepNext w:val="false"/>
         <w:spacing w:after="160" w:line="300"/>
         <w:jc w:val="both"/>
       </w:pPr>
@@ -882,11 +887,12 @@
         <w:t xml:space="preserve">não é armazenado</w:t>
       </w:r>
       <w:r>
-        <w:t xml:space="preserve">; ficam gravadas apenas as transações que o titular confirmar após revisá-las, além do código que as identifica no extrato. Números de agência e conta presentes no arquivo são usados somente para compor esse código.</w:t>
-      </w:r>
-    </w:p>
-    <w:p>
-      <w:pPr>
+        <w:t xml:space="preserve">; ficam gravadas apenas as transações que o titular confirmar após revisá-las, além do código que as identifica no extrato. Os números do banco e da conta presentes no arquivo ficam gravados apenas como parte desse código, para distinguir transações de contas diferentes.</w:t>
+      </w:r>
+    </w:p>
+    <w:p>
+      <w:pPr>
+        <w:keepNext w:val="false"/>
         <w:spacing w:after="160" w:line="300"/>
         <w:jc w:val="both"/>
       </w:pPr>
@@ -931,6 +937,7 @@
     </w:p>
     <w:p>
       <w:pPr>
+        <w:keepNext/>
         <w:spacing w:after="160" w:line="300"/>
         <w:jc w:val="both"/>
       </w:pPr>
@@ -941,6 +948,7 @@
     <w:p>
       <w:pPr>
         <w:pStyle w:val="ListParagraph"/>
+        <w:keepNext/>
         <w:numPr>
           <w:ilvl w:val="0"/>
           <w:numId w:val="2"/>
@@ -955,6 +963,7 @@
     <w:p>
       <w:pPr>
         <w:pStyle w:val="ListParagraph"/>
+        <w:keepNext/>
         <w:numPr>
           <w:ilvl w:val="0"/>
           <w:numId w:val="2"/>
@@ -969,6 +978,7 @@
     <w:p>
       <w:pPr>
         <w:pStyle w:val="ListParagraph"/>
+        <w:keepNext/>
         <w:numPr>
           <w:ilvl w:val="0"/>
           <w:numId w:val="2"/>
@@ -983,6 +993,7 @@
     <w:p>
       <w:pPr>
         <w:pStyle w:val="ListParagraph"/>
+        <w:keepNext w:val="false"/>
         <w:numPr>
           <w:ilvl w:val="0"/>
           <w:numId w:val="2"/>
@@ -996,6 +1007,7 @@
     </w:p>
     <w:p>
       <w:pPr>
+        <w:keepNext w:val="false"/>
         <w:spacing w:after="160" w:line="300"/>
         <w:jc w:val="both"/>
       </w:pPr>
@@ -1012,6 +1024,7 @@
     </w:p>
     <w:p>
       <w:pPr>
+        <w:keepNext w:val="false"/>
         <w:spacing w:after="160" w:line="300"/>
         <w:jc w:val="both"/>
       </w:pPr>
@@ -1049,6 +1062,7 @@
     </w:p>
     <w:p>
       <w:pPr>
+        <w:keepNext w:val="false"/>
         <w:spacing w:after="160" w:line="300"/>
         <w:jc w:val="both"/>
       </w:pPr>
@@ -1058,6 +1072,7 @@
     </w:p>
     <w:p>
       <w:pPr>
+        <w:keepNext/>
         <w:spacing w:after="160" w:line="300"/>
         <w:jc w:val="both"/>
       </w:pPr>
@@ -1078,6 +1093,7 @@
     <w:p>
       <w:pPr>
         <w:pStyle w:val="ListParagraph"/>
+        <w:keepNext w:val="false"/>
         <w:numPr>
           <w:ilvl w:val="0"/>
           <w:numId w:val="3"/>
@@ -1092,6 +1108,7 @@
     <w:p>
       <w:pPr>
         <w:pStyle w:val="ListParagraph"/>
+        <w:keepNext w:val="false"/>
         <w:numPr>
           <w:ilvl w:val="0"/>
           <w:numId w:val="3"/>
@@ -1106,6 +1123,7 @@
     <w:p>
       <w:pPr>
         <w:pStyle w:val="ListParagraph"/>
+        <w:keepNext w:val="false"/>
         <w:numPr>
           <w:ilvl w:val="0"/>
           <w:numId w:val="3"/>
@@ -1120,6 +1138,7 @@
     <w:p>
       <w:pPr>
         <w:pStyle w:val="ListParagraph"/>
+        <w:keepNext w:val="false"/>
         <w:numPr>
           <w:ilvl w:val="0"/>
           <w:numId w:val="3"/>
@@ -1134,6 +1153,7 @@
     <w:p>
       <w:pPr>
         <w:pStyle w:val="ListParagraph"/>
+        <w:keepNext w:val="false"/>
         <w:numPr>
           <w:ilvl w:val="0"/>
           <w:numId w:val="3"/>
@@ -1148,6 +1168,7 @@
     <w:p>
       <w:pPr>
         <w:pStyle w:val="ListParagraph"/>
+        <w:keepNext w:val="false"/>
         <w:numPr>
           <w:ilvl w:val="0"/>
           <w:numId w:val="3"/>
@@ -1162,34 +1183,52 @@
     <w:p>
       <w:pPr>
         <w:pStyle w:val="ListParagraph"/>
-        <w:numPr>
-          <w:ilvl w:val="0"/>
-          <w:numId w:val="3"/>
-        </w:numPr>
-        <w:spacing w:after="80" w:line="290"/>
-        <w:jc w:val="both"/>
-      </w:pPr>
-      <w:r>
-        <w:t xml:space="preserve">situação da reserva de emergência (valor guardado, meta e se está completa);</w:t>
-      </w:r>
-    </w:p>
-    <w:p>
-      <w:pPr>
-        <w:pStyle w:val="ListParagraph"/>
-        <w:numPr>
-          <w:ilvl w:val="0"/>
-          <w:numId w:val="3"/>
-        </w:numPr>
-        <w:spacing w:after="80" w:line="290"/>
-        <w:jc w:val="both"/>
-      </w:pPr>
-      <w:r>
-        <w:t xml:space="preserve">score financeiro;</w:t>
-      </w:r>
-    </w:p>
-    <w:p>
-      <w:pPr>
-        <w:pStyle w:val="ListParagraph"/>
+        <w:keepNext w:val="false"/>
+        <w:numPr>
+          <w:ilvl w:val="0"/>
+          <w:numId w:val="3"/>
+        </w:numPr>
+        <w:spacing w:after="80" w:line="290"/>
+        <w:jc w:val="both"/>
+      </w:pPr>
+      <w:r>
+        <w:t xml:space="preserve">despesa média mensal;</w:t>
+      </w:r>
+    </w:p>
+    <w:p>
+      <w:pPr>
+        <w:pStyle w:val="ListParagraph"/>
+        <w:keepNext w:val="false"/>
+        <w:numPr>
+          <w:ilvl w:val="0"/>
+          <w:numId w:val="3"/>
+        </w:numPr>
+        <w:spacing w:after="80" w:line="290"/>
+        <w:jc w:val="both"/>
+      </w:pPr>
+      <w:r>
+        <w:t xml:space="preserve">situação da reserva de emergência (valor guardado, valor ideal, título e prazo da meta de reserva e se está completa);</w:t>
+      </w:r>
+    </w:p>
+    <w:p>
+      <w:pPr>
+        <w:pStyle w:val="ListParagraph"/>
+        <w:keepNext w:val="false"/>
+        <w:numPr>
+          <w:ilvl w:val="0"/>
+          <w:numId w:val="3"/>
+        </w:numPr>
+        <w:spacing w:after="80" w:line="290"/>
+        <w:jc w:val="both"/>
+      </w:pPr>
+      <w:r>
+        <w:t xml:space="preserve">score financeiro e a pontuação de cada critério que o compõe;</w:t>
+      </w:r>
+    </w:p>
+    <w:p>
+      <w:pPr>
+        <w:pStyle w:val="ListParagraph"/>
+        <w:keepNext w:val="false"/>
         <w:numPr>
           <w:ilvl w:val="0"/>
           <w:numId w:val="3"/>
@@ -1203,6 +1242,7 @@
     </w:p>
     <w:p>
       <w:pPr>
+        <w:keepNext w:val="false"/>
         <w:spacing w:after="160" w:line="300"/>
         <w:jc w:val="both"/>
       </w:pPr>
@@ -1219,6 +1259,7 @@
     </w:p>
     <w:p>
       <w:pPr>
+        <w:keepNext w:val="false"/>
         <w:spacing w:after="160" w:line="300"/>
         <w:jc w:val="both"/>
       </w:pPr>
@@ -1228,6 +1269,7 @@
     </w:p>
     <w:p>
       <w:pPr>
+        <w:keepNext w:val="false"/>
         <w:spacing w:after="160" w:line="300"/>
         <w:jc w:val="both"/>
       </w:pPr>
@@ -1257,6 +1299,7 @@
     </w:p>
     <w:p>
       <w:pPr>
+        <w:keepNext w:val="false"/>
         <w:spacing w:after="160" w:line="300"/>
         <w:jc w:val="both"/>
       </w:pPr>
@@ -1273,6 +1316,7 @@
     </w:p>
     <w:p>
       <w:pPr>
+        <w:keepNext w:val="false"/>
         <w:spacing w:after="160" w:line="300"/>
         <w:jc w:val="both"/>
       </w:pPr>
@@ -1310,6 +1354,7 @@
     </w:p>
     <w:p>
       <w:pPr>
+        <w:keepNext w:val="false"/>
         <w:spacing w:after="160" w:line="300"/>
         <w:jc w:val="both"/>
       </w:pPr>
@@ -1336,6 +1381,7 @@
     </w:p>
     <w:p>
       <w:pPr>
+        <w:keepNext w:val="false"/>
         <w:spacing w:after="160" w:line="300"/>
         <w:jc w:val="both"/>
       </w:pPr>
@@ -1370,6 +1416,7 @@
     </w:p>
     <w:p>
       <w:pPr>
+        <w:keepNext w:val="false"/>
         <w:spacing w:after="160" w:line="300"/>
         <w:jc w:val="both"/>
       </w:pPr>
@@ -1379,6 +1426,7 @@
     </w:p>
     <w:p>
       <w:pPr>
+        <w:keepNext w:val="false"/>
         <w:spacing w:after="160" w:line="300"/>
         <w:jc w:val="both"/>
       </w:pPr>
@@ -1393,6 +1441,7 @@
     <w:p>
       <w:pPr>
         <w:pStyle w:val="ListParagraph"/>
+        <w:keepNext w:val="false"/>
         <w:numPr>
           <w:ilvl w:val="0"/>
           <w:numId w:val="3"/>
@@ -1407,6 +1456,22 @@
     <w:p>
       <w:pPr>
         <w:pStyle w:val="ListParagraph"/>
+        <w:keepNext w:val="false"/>
+        <w:numPr>
+          <w:ilvl w:val="0"/>
+          <w:numId w:val="3"/>
+        </w:numPr>
+        <w:spacing w:after="80" w:line="290"/>
+        <w:jc w:val="both"/>
+      </w:pPr>
+      <w:r>
+        <w:t xml:space="preserve">Exigência de senha com no mínimo 6 caracteres, contendo letra, número e caractere especial;</w:t>
+      </w:r>
+    </w:p>
+    <w:p>
+      <w:pPr>
+        <w:pStyle w:val="ListParagraph"/>
+        <w:keepNext w:val="false"/>
         <w:numPr>
           <w:ilvl w:val="0"/>
           <w:numId w:val="3"/>
@@ -1421,6 +1486,7 @@
     <w:p>
       <w:pPr>
         <w:pStyle w:val="ListParagraph"/>
+        <w:keepNext w:val="false"/>
         <w:numPr>
           <w:ilvl w:val="0"/>
           <w:numId w:val="3"/>
@@ -1435,6 +1501,7 @@
     <w:p>
       <w:pPr>
         <w:pStyle w:val="ListParagraph"/>
+        <w:keepNext w:val="false"/>
         <w:numPr>
           <w:ilvl w:val="0"/>
           <w:numId w:val="3"/>
@@ -1449,19 +1516,21 @@
     <w:p>
       <w:pPr>
         <w:pStyle w:val="ListParagraph"/>
-        <w:numPr>
-          <w:ilvl w:val="0"/>
-          <w:numId w:val="3"/>
-        </w:numPr>
-        <w:spacing w:after="80" w:line="290"/>
-        <w:jc w:val="both"/>
-      </w:pPr>
-      <w:r>
-        <w:t xml:space="preserve">Exclusão em cascata: ao excluir a conta, são apagadas também as movimentações, metas, investimentos e limites de categoria vinculados.</w:t>
-      </w:r>
-    </w:p>
-    <w:p>
-      <w:pPr>
+        <w:keepNext w:val="false"/>
+        <w:numPr>
+          <w:ilvl w:val="0"/>
+          <w:numId w:val="3"/>
+        </w:numPr>
+        <w:spacing w:after="80" w:line="290"/>
+        <w:jc w:val="both"/>
+      </w:pPr>
+      <w:r>
+        <w:t xml:space="preserve">Exclusão em cascata: ao excluir a conta, são apagados também todos os dados vinculados a ela — movimentações, metas, investimentos, limites de categoria, recorrências, transações importadas de extrato, histórico do score e registro de sessões encerradas. A exclusão pode ser feita pelo próprio titular no aplicativo, mediante confirmação da senha.</w:t>
+      </w:r>
+    </w:p>
+    <w:p>
+      <w:pPr>
+        <w:keepNext w:val="false"/>
         <w:spacing w:after="160" w:line="300"/>
         <w:jc w:val="both"/>
       </w:pPr>
@@ -1475,6 +1544,7 @@
     </w:p>
     <w:p>
       <w:pPr>
+        <w:keepNext/>
         <w:spacing w:after="160" w:line="300"/>
         <w:jc w:val="both"/>
       </w:pPr>
@@ -1505,6 +1575,7 @@
     <w:p>
       <w:pPr>
         <w:pStyle w:val="ListParagraph"/>
+        <w:keepNext/>
         <w:numPr>
           <w:ilvl w:val="0"/>
           <w:numId w:val="3"/>
@@ -1519,6 +1590,7 @@
     <w:p>
       <w:pPr>
         <w:pStyle w:val="ListParagraph"/>
+        <w:keepNext/>
         <w:numPr>
           <w:ilvl w:val="0"/>
           <w:numId w:val="3"/>
@@ -1533,6 +1605,7 @@
     <w:p>
       <w:pPr>
         <w:pStyle w:val="ListParagraph"/>
+        <w:keepNext w:val="false"/>
         <w:numPr>
           <w:ilvl w:val="0"/>
           <w:numId w:val="3"/>
@@ -1546,6 +1619,7 @@
     </w:p>
     <w:p>
       <w:pPr>
+        <w:keepNext w:val="false"/>
         <w:spacing w:after="160" w:line="300"/>
         <w:jc w:val="both"/>
       </w:pPr>
@@ -1583,6 +1657,7 @@
     </w:p>
     <w:p>
       <w:pPr>
+        <w:keepNext/>
         <w:spacing w:after="160" w:line="300"/>
         <w:jc w:val="both"/>
       </w:pPr>
@@ -1593,6 +1668,7 @@
     <w:p>
       <w:pPr>
         <w:pStyle w:val="ListParagraph"/>
+        <w:keepNext w:val="false"/>
         <w:numPr>
           <w:ilvl w:val="0"/>
           <w:numId w:val="3"/>
@@ -1614,6 +1690,7 @@
     <w:p>
       <w:pPr>
         <w:pStyle w:val="ListParagraph"/>
+        <w:keepNext w:val="false"/>
         <w:numPr>
           <w:ilvl w:val="0"/>
           <w:numId w:val="3"/>
@@ -1629,12 +1706,13 @@
         <w:t xml:space="preserve">Solicitar a exclusão</w:t>
       </w:r>
       <w:r>
-        <w:t xml:space="preserve"> de seus dados pessoais — disponível diretamente no aplicativo, pela opção de excluir conta, na aba Perfil;</w:t>
-      </w:r>
-    </w:p>
-    <w:p>
-      <w:pPr>
-        <w:pStyle w:val="ListParagraph"/>
+        <w:t xml:space="preserve"> de seus dados pessoais — disponível diretamente no aplicativo, pela opção "Excluir conta", na aba Perfil, com confirmação da senha;</w:t>
+      </w:r>
+    </w:p>
+    <w:p>
+      <w:pPr>
+        <w:pStyle w:val="ListParagraph"/>
+        <w:keepNext w:val="false"/>
         <w:numPr>
           <w:ilvl w:val="0"/>
           <w:numId w:val="3"/>
@@ -1656,6 +1734,7 @@
     <w:p>
       <w:pPr>
         <w:pStyle w:val="ListParagraph"/>
+        <w:keepNext w:val="false"/>
         <w:numPr>
           <w:ilvl w:val="0"/>
           <w:numId w:val="3"/>
@@ -1670,6 +1749,7 @@
     <w:p>
       <w:pPr>
         <w:pStyle w:val="ListParagraph"/>
+        <w:keepNext w:val="false"/>
         <w:numPr>
           <w:ilvl w:val="0"/>
           <w:numId w:val="3"/>
@@ -1684,6 +1764,7 @@
     <w:p>
       <w:pPr>
         <w:pStyle w:val="ListParagraph"/>
+        <w:keepNext w:val="false"/>
         <w:numPr>
           <w:ilvl w:val="0"/>
           <w:numId w:val="3"/>
@@ -1698,6 +1779,7 @@
     <w:p>
       <w:pPr>
         <w:pStyle w:val="ListParagraph"/>
+        <w:keepNext w:val="false"/>
         <w:numPr>
           <w:ilvl w:val="0"/>
           <w:numId w:val="3"/>
@@ -1712,6 +1794,7 @@
     <w:p>
       <w:pPr>
         <w:pStyle w:val="ListParagraph"/>
+        <w:keepNext w:val="false"/>
         <w:numPr>
           <w:ilvl w:val="0"/>
           <w:numId w:val="3"/>
@@ -1726,6 +1809,7 @@
     <w:p>
       <w:pPr>
         <w:pStyle w:val="ListParagraph"/>
+        <w:keepNext w:val="false"/>
         <w:numPr>
           <w:ilvl w:val="0"/>
           <w:numId w:val="3"/>
@@ -1740,6 +1824,7 @@
     <w:p>
       <w:pPr>
         <w:pStyle w:val="ListParagraph"/>
+        <w:keepNext w:val="false"/>
         <w:numPr>
           <w:ilvl w:val="0"/>
           <w:numId w:val="3"/>
@@ -1753,6 +1838,7 @@
     </w:p>
     <w:p>
       <w:pPr>
+        <w:keepNext w:val="false"/>
         <w:spacing w:after="160" w:line="300"/>
         <w:jc w:val="both"/>
       </w:pPr>
@@ -1797,6 +1883,7 @@
     </w:p>
     <w:p>
       <w:pPr>
+        <w:keepNext/>
         <w:spacing w:after="160" w:line="300"/>
         <w:jc w:val="both"/>
       </w:pPr>
@@ -1806,6 +1893,7 @@
     </w:p>
     <w:p>
       <w:pPr>
+        <w:keepNext w:val="false"/>
         <w:spacing w:after="160" w:line="300"/>
         <w:jc w:val="both"/>
       </w:pPr>
@@ -1822,6 +1910,7 @@
     </w:p>
     <w:p>
       <w:pPr>
+        <w:keepNext w:val="false"/>
         <w:spacing w:after="160" w:line="300"/>
         <w:jc w:val="both"/>
       </w:pPr>
@@ -1849,6 +1938,7 @@
     </w:p>
     <w:p>
       <w:pPr>
+        <w:keepNext/>
         <w:spacing w:after="160" w:line="300"/>
         <w:jc w:val="both"/>
       </w:pPr>
@@ -1859,6 +1949,7 @@
     <w:p>
       <w:pPr>
         <w:pStyle w:val="ListParagraph"/>
+        <w:keepNext/>
         <w:numPr>
           <w:ilvl w:val="0"/>
           <w:numId w:val="3"/>
@@ -1880,6 +1971,7 @@
     <w:p>
       <w:pPr>
         <w:pStyle w:val="ListParagraph"/>
+        <w:keepNext/>
         <w:numPr>
           <w:ilvl w:val="0"/>
           <w:numId w:val="3"/>
@@ -1901,6 +1993,7 @@
     <w:p>
       <w:pPr>
         <w:pStyle w:val="ListParagraph"/>
+        <w:keepNext/>
         <w:numPr>
           <w:ilvl w:val="0"/>
           <w:numId w:val="3"/>
@@ -1922,6 +2015,7 @@
     <w:p>
       <w:pPr>
         <w:pStyle w:val="ListParagraph"/>
+        <w:keepNext w:val="false"/>
         <w:numPr>
           <w:ilvl w:val="0"/>
           <w:numId w:val="3"/>
@@ -1960,6 +2054,7 @@
     </w:p>
     <w:p>
       <w:pPr>
+        <w:keepNext w:val="false"/>
         <w:spacing w:after="160" w:line="300"/>
         <w:jc w:val="both"/>
       </w:pPr>
@@ -1969,6 +2064,7 @@
     </w:p>
     <w:p>
       <w:pPr>
+        <w:keepNext w:val="false"/>
         <w:spacing w:after="160" w:line="300"/>
         <w:jc w:val="both"/>
       </w:pPr>
@@ -1988,6 +2084,7 @@
     </w:p>
     <w:p>
       <w:pPr>
+        <w:keepNext w:val="false"/>
         <w:spacing w:after="160" w:line="300"/>
         <w:jc w:val="both"/>
       </w:pPr>
@@ -2015,6 +2112,7 @@
     </w:p>
     <w:p>
       <w:pPr>
+        <w:keepNext w:val="false"/>
         <w:spacing w:after="160" w:line="300"/>
         <w:jc w:val="both"/>
       </w:pPr>
@@ -2034,6 +2132,7 @@
     </w:p>
     <w:p>
       <w:pPr>
+        <w:keepNext w:val="false"/>
         <w:spacing w:after="160" w:line="300"/>
         <w:jc w:val="both"/>
       </w:pPr>
@@ -2053,6 +2152,7 @@
     </w:p>
     <w:p>
       <w:pPr>
+        <w:keepNext w:val="false"/>
         <w:spacing w:after="160" w:line="300"/>
         <w:jc w:val="both"/>
       </w:pPr>
@@ -2080,6 +2180,7 @@
     </w:p>
     <w:p>
       <w:pPr>
+        <w:keepNext/>
         <w:spacing w:after="160" w:line="300"/>
         <w:jc w:val="both"/>
       </w:pPr>
@@ -2099,6 +2200,7 @@
     <w:p>
       <w:pPr>
         <w:pStyle w:val="ListParagraph"/>
+        <w:keepNext/>
         <w:numPr>
           <w:ilvl w:val="0"/>
           <w:numId w:val="3"/>
@@ -2119,6 +2221,7 @@
     <w:p>
       <w:pPr>
         <w:pStyle w:val="ListParagraph"/>
+        <w:keepNext/>
         <w:numPr>
           <w:ilvl w:val="0"/>
           <w:numId w:val="3"/>
@@ -2139,6 +2242,7 @@
     <w:p>
       <w:pPr>
         <w:pStyle w:val="ListParagraph"/>
+        <w:keepNext w:val="false"/>
         <w:numPr>
           <w:ilvl w:val="0"/>
           <w:numId w:val="3"/>
@@ -2225,8 +2329,29 @@
         <w:szCs w:val="16"/>
       </w:rPr>
       <w:fldChar w:fldCharType="begin"/>
+    </w:r>
+    <w:r>
+      <w:rPr>
+        <w:color w:val="666666"/>
+        <w:sz w:val="16"/>
+        <w:szCs w:val="16"/>
+      </w:rPr>
       <w:instrText xml:space="preserve">PAGE</w:instrText>
+    </w:r>
+    <w:r>
+      <w:rPr>
+        <w:color w:val="666666"/>
+        <w:sz w:val="16"/>
+        <w:szCs w:val="16"/>
+      </w:rPr>
       <w:fldChar w:fldCharType="separate"/>
+    </w:r>
+    <w:r>
+      <w:rPr>
+        <w:color w:val="666666"/>
+        <w:sz w:val="16"/>
+        <w:szCs w:val="16"/>
+      </w:rPr>
       <w:fldChar w:fldCharType="end"/>
     </w:r>
   </w:p>

</xml_diff>